<commit_message>
Add Workflow dashboard page; exclude sentiment from Master Grafik interpolation
- New Streamlit page "Workflow" renders a Graphviz pipeline diagram from
  raw sources through loaders, raw storage, processing, processed storage
  to dashboard. Includes a plain-language layer-by-layer explanation.
- Master Grafik 1 and 2 interpolation (fill_gaps) now applies only to
  forex/oil series. Sentiment reihen bleiben NaN, weil "kein Artikel"
  ungleich "neutrale Nachricht" ist. Checkbox-Help-Text explizit ergaenzt.
- DOKUMENTATION.md Section 4.2 verschaerft: kein Interpolieren auf
  Sentiment, nirgends. Protokoll und Dashboard-Seitenliste aktualisiert.
- DOKUMENTATION.docx regeneriert.

Co-Authored-By: Claude Opus 4.7 (1M context) <noreply@anthropic.com>
</commit_message>
<xml_diff>
--- a/DOKUMENTATION.docx
+++ b/DOKUMENTATION.docx
@@ -933,10 +933,10 @@
         <w:rPr>
           <w:b/>
         </w:rPr>
-        <w:t>nur auf Anzeige</w:t>
+        <w:t>ausschließlich auf Forex- und Öl-Reihen</w:t>
       </w:r>
       <w:r>
-        <w:t>, schreibt keine Werte zurück. So bleibt die Rohdaten-Integrität gewahrt und der User sieht, wo der Effekt auftritt.</w:t>
+        <w:t>, niemals auf Sentiment. Außerdem wirkt er nur auf die Anzeige, schreibt keine Werte zurück. So bleibt die Rohdaten-Integrität gewahrt und der User sieht, wo der Effekt auftritt.</w:t>
       </w:r>
     </w:p>
     <w:p>
@@ -979,7 +979,21 @@
         <w:pStyle w:val="ListBullet"/>
       </w:pPr>
       <w:r>
-        <w:t xml:space="preserve">Imputation wäre irreführend, weil es </w:t>
+        <w:rPr>
+          <w:b/>
+        </w:rPr>
+        <w:t>Kein Interpolieren — nirgends.</w:t>
+      </w:r>
+      <w:r>
+        <w:t xml:space="preserve"> Weder im Rohdatenlayer noch im Processing, noch im Dashboard. Selbst wenn der User im Dashboard die Interpolations-Checkbox aktiviert, werden Sentiment-Reihen explizit ausgenommen.</w:t>
+      </w:r>
+    </w:p>
+    <w:p>
+      <w:pPr>
+        <w:pStyle w:val="ListBullet"/>
+      </w:pPr>
+      <w:r>
+        <w:t xml:space="preserve">Begründung: Imputation wäre irreführend, weil es </w:t>
       </w:r>
       <w:r>
         <w:rPr>
@@ -988,7 +1002,7 @@
         <w:t>keine Nachricht ≠ neutrale Nachricht</w:t>
       </w:r>
       <w:r>
-        <w:t xml:space="preserve"> ist. Eine Null-Imputation würde falschen Einfluss auf das Tagesmittel haben.</w:t>
+        <w:t xml:space="preserve"> ist. Eine Null-Imputation oder Zeit-Interpolation würde falschen Einfluss auf das Tagesmittel haben und eine nicht vorhandene Nachrichtenlage vortäuschen.</w:t>
       </w:r>
     </w:p>
     <w:p>
@@ -3091,6 +3105,33 @@
           </w:p>
         </w:tc>
       </w:tr>
+      <w:tr>
+        <w:tc>
+          <w:tcPr>
+            <w:tcW w:type="dxa" w:w="4320"/>
+          </w:tcPr>
+          <w:p>
+            <w:r/>
+            <w:r>
+              <w:rPr>
+                <w:b/>
+              </w:rPr>
+              <w:t>Workflow</w:t>
+            </w:r>
+          </w:p>
+        </w:tc>
+        <w:tc>
+          <w:tcPr>
+            <w:tcW w:type="dxa" w:w="4320"/>
+          </w:tcPr>
+          <w:p>
+            <w:r/>
+            <w:r>
+              <w:t>Pipeline-Diagramm des Projekts (Rohdaten → Processing → Dashboard) als Graphviz-Visualisierung inkl. Erläuterung der Schichten</w:t>
+            </w:r>
+          </w:p>
+        </w:tc>
+      </w:tr>
     </w:tbl>
     <w:p/>
     <w:p>
@@ -4073,6 +4114,54 @@
           </w:p>
         </w:tc>
       </w:tr>
+      <w:tr>
+        <w:tc>
+          <w:tcPr>
+            <w:tcW w:type="dxa" w:w="4320"/>
+          </w:tcPr>
+          <w:p>
+            <w:r/>
+            <w:r>
+              <w:t>22.04.</w:t>
+            </w:r>
+          </w:p>
+        </w:tc>
+        <w:tc>
+          <w:tcPr>
+            <w:tcW w:type="dxa" w:w="4320"/>
+          </w:tcPr>
+          <w:p>
+            <w:r/>
+            <w:r>
+              <w:t>Präzisierung: die Interpolations-Option in Master Grafik 1 und 2 überspringt Sentiment-Reihen. Begründung siehe 4.2.</w:t>
+            </w:r>
+          </w:p>
+        </w:tc>
+      </w:tr>
+      <w:tr>
+        <w:tc>
+          <w:tcPr>
+            <w:tcW w:type="dxa" w:w="4320"/>
+          </w:tcPr>
+          <w:p>
+            <w:r/>
+            <w:r>
+              <w:t>22.04.</w:t>
+            </w:r>
+          </w:p>
+        </w:tc>
+        <w:tc>
+          <w:tcPr>
+            <w:tcW w:type="dxa" w:w="4320"/>
+          </w:tcPr>
+          <w:p>
+            <w:r/>
+            <w:r>
+              <w:t>Neue Dashboard-Seite „Workflow" mit Graphviz-Diagramm der Pipeline (Rohdaten → Loader → Raw-Storage → Processing → Processed-Storage → Dashboard).</w:t>
+            </w:r>
+          </w:p>
+        </w:tc>
+      </w:tr>
     </w:tbl>
     <w:p/>
     <w:p>
@@ -4082,20 +4171,6 @@
       </w:pPr>
       <w:r>
         <w:t>16. Offen / ToDo</w:t>
-      </w:r>
-    </w:p>
-    <w:p>
-      <w:pPr>
-        <w:pStyle w:val="ListBullet"/>
-      </w:pPr>
-      <w:r>
-        <w:rPr>
-          <w:b/>
-        </w:rPr>
-        <w:t>Workflow-Grafik</w:t>
-      </w:r>
-      <w:r>
-        <w:t xml:space="preserve"> im Streamlit visualisieren (eigene Seite, die diese Pipeline als Diagramm zeigt).</w:t>
       </w:r>
     </w:p>
     <w:p>

</xml_diff>

<commit_message>
Granger-Test ergaenzt und Abbildungen farbenblind-sicher
Analyse:
- Granger-Test gerechnet (statsmodels neu in requirements). Befund: Sentiment
  liefert einen statistisch signifikanten, aber sehr kleinen Vorhersagebeitrag
  zur Kursveraenderung (p<0.01 fuer beide Paare); bei GBP/USD einseitig
  Sentiment->Kurs. Bei n~1100 werden kleine Effekte signifikant -> als Lead zu
  schwach. Neuer Abschnitt 9.4 + Tabelle 7, Diskussion (Kap. 10) entsprechend
  differenziert. Granger-Zelle im Lead/Lag-Notebook aktiviert (beide Paare,
  beide Richtungen).

Visualisierung (W8-Regeln):
- Rot/Gruen-Paare entfernt (Sentiment-Balken, Quellenvergleich) -> farbenblind-
  sichere Okabe-Ito-Palette (Blau #0072B2, Orange #E69F00, Vermillion #D55E00),
  Kurslinie neutral schwarz. Gilt fuer Bericht-Figuren und Notebook.

Co-Authored-By: Claude Opus 4.8 (1M context) <noreply@anthropic.com>
</commit_message>
<xml_diff>
--- a/DOKUMENTATION.docx
+++ b/DOKUMENTATION.docx
@@ -215,7 +215,12 @@
     </w:p>
     <w:p>
       <w:r>
-        <w:t>Tabelle 7: Glossar der wichtigsten Begriffe</w:t>
+        <w:t>Tabelle 7: Granger-Test, p-Werte für den Vorhersagebeitrag des Sentiments</w:t>
+      </w:r>
+    </w:p>
+    <w:p>
+      <w:r>
+        <w:t>Tabelle 8: Glossar der wichtigsten Begriffe</w:t>
       </w:r>
     </w:p>
     <w:p>
@@ -3511,7 +3516,344 @@
         <w:pStyle w:val="Heading2"/>
       </w:pPr>
       <w:r>
-        <w:t>9.4 Warum eine reine Kursgrafik einen Vorlauf vermuten lässt</w:t>
+        <w:t>9.4 Formaler Vorhersagetest (Granger-Test)</w:t>
+      </w:r>
+    </w:p>
+    <w:p>
+      <w:r>
+        <w:t>Die Korrelation misst den Zusammenhang je Verschiebung einzeln. Ein strengerer, formaler Test ist der Granger-Test. Er prüft, ob die Vergangenheit des Sentiments die Vorhersage der Kursveränderung verbessert, über das hinaus, was die eigene Vergangenheit der Kursveränderung bereits leistet. Ein kleiner Wert (unter 0.05) in der folgenden Tabelle bedeutet, dass das Sentiment einen eigenen Vorhersagebeitrag liefert.</w:t>
+      </w:r>
+    </w:p>
+    <w:p>
+      <w:pPr>
+        <w:jc w:val="center"/>
+      </w:pPr>
+      <w:r>
+        <w:rPr>
+          <w:i/>
+          <w:sz w:val="18"/>
+        </w:rPr>
+        <w:t>Tabelle 7: Granger-Test, p-Werte für den Vorhersagebeitrag des Sentiments</w:t>
+      </w:r>
+    </w:p>
+    <w:tbl>
+      <w:tblPr>
+        <w:tblStyle w:val="TableGrid"/>
+        <w:tblW w:type="auto" w:w="0"/>
+        <w:jc w:val="center"/>
+        <w:tblLook w:firstColumn="1" w:firstRow="1" w:lastColumn="0" w:lastRow="0" w:noHBand="0" w:noVBand="1" w:val="04A0"/>
+      </w:tblPr>
+      <w:tblGrid>
+        <w:gridCol w:w="2880"/>
+        <w:gridCol w:w="2880"/>
+        <w:gridCol w:w="2880"/>
+      </w:tblGrid>
+      <w:tr>
+        <w:tc>
+          <w:tcPr>
+            <w:tcW w:type="dxa" w:w="1984"/>
+            <w:shd w:val="clear" w:color="auto" w:fill="404040"/>
+          </w:tcPr>
+          <w:p>
+            <w:r/>
+            <w:r>
+              <w:rPr>
+                <w:b/>
+                <w:color w:val="FFFFFF"/>
+                <w:sz w:val="18"/>
+              </w:rPr>
+              <w:t>Verzögerung</w:t>
+            </w:r>
+          </w:p>
+        </w:tc>
+        <w:tc>
+          <w:tcPr>
+            <w:tcW w:type="dxa" w:w="3118"/>
+            <w:shd w:val="clear" w:color="auto" w:fill="404040"/>
+          </w:tcPr>
+          <w:p>
+            <w:r/>
+            <w:r>
+              <w:rPr>
+                <w:b/>
+                <w:color w:val="FFFFFF"/>
+                <w:sz w:val="18"/>
+              </w:rPr>
+              <w:t>EUR/USD: Sentiment sagt Kurs voraus</w:t>
+            </w:r>
+          </w:p>
+        </w:tc>
+        <w:tc>
+          <w:tcPr>
+            <w:tcW w:type="dxa" w:w="3118"/>
+            <w:shd w:val="clear" w:color="auto" w:fill="404040"/>
+          </w:tcPr>
+          <w:p>
+            <w:r/>
+            <w:r>
+              <w:rPr>
+                <w:b/>
+                <w:color w:val="FFFFFF"/>
+                <w:sz w:val="18"/>
+              </w:rPr>
+              <w:t>GBP/USD: Sentiment sagt Kurs voraus</w:t>
+            </w:r>
+          </w:p>
+        </w:tc>
+      </w:tr>
+      <w:tr>
+        <w:tc>
+          <w:tcPr>
+            <w:tcW w:type="dxa" w:w="1984"/>
+          </w:tcPr>
+          <w:p>
+            <w:r/>
+            <w:r>
+              <w:rPr>
+                <w:b w:val="0"/>
+                <w:sz w:val="18"/>
+              </w:rPr>
+              <w:t>1 Tag</w:t>
+            </w:r>
+          </w:p>
+        </w:tc>
+        <w:tc>
+          <w:tcPr>
+            <w:tcW w:type="dxa" w:w="3118"/>
+          </w:tcPr>
+          <w:p>
+            <w:r/>
+            <w:r>
+              <w:rPr>
+                <w:b w:val="0"/>
+                <w:sz w:val="18"/>
+              </w:rPr>
+              <w:t>0.001</w:t>
+            </w:r>
+          </w:p>
+        </w:tc>
+        <w:tc>
+          <w:tcPr>
+            <w:tcW w:type="dxa" w:w="3118"/>
+          </w:tcPr>
+          <w:p>
+            <w:r/>
+            <w:r>
+              <w:rPr>
+                <w:b w:val="0"/>
+                <w:sz w:val="18"/>
+              </w:rPr>
+              <w:t>0.000</w:t>
+            </w:r>
+          </w:p>
+        </w:tc>
+      </w:tr>
+      <w:tr>
+        <w:tc>
+          <w:tcPr>
+            <w:tcW w:type="dxa" w:w="1984"/>
+          </w:tcPr>
+          <w:p>
+            <w:r/>
+            <w:r>
+              <w:rPr>
+                <w:b w:val="0"/>
+                <w:sz w:val="18"/>
+              </w:rPr>
+              <w:t>2 Tage</w:t>
+            </w:r>
+          </w:p>
+        </w:tc>
+        <w:tc>
+          <w:tcPr>
+            <w:tcW w:type="dxa" w:w="3118"/>
+          </w:tcPr>
+          <w:p>
+            <w:r/>
+            <w:r>
+              <w:rPr>
+                <w:b w:val="0"/>
+                <w:sz w:val="18"/>
+              </w:rPr>
+              <w:t>0.000</w:t>
+            </w:r>
+          </w:p>
+        </w:tc>
+        <w:tc>
+          <w:tcPr>
+            <w:tcW w:type="dxa" w:w="3118"/>
+          </w:tcPr>
+          <w:p>
+            <w:r/>
+            <w:r>
+              <w:rPr>
+                <w:b w:val="0"/>
+                <w:sz w:val="18"/>
+              </w:rPr>
+              <w:t>0.000</w:t>
+            </w:r>
+          </w:p>
+        </w:tc>
+      </w:tr>
+      <w:tr>
+        <w:tc>
+          <w:tcPr>
+            <w:tcW w:type="dxa" w:w="1984"/>
+          </w:tcPr>
+          <w:p>
+            <w:r/>
+            <w:r>
+              <w:rPr>
+                <w:b w:val="0"/>
+                <w:sz w:val="18"/>
+              </w:rPr>
+              <w:t>3 Tage</w:t>
+            </w:r>
+          </w:p>
+        </w:tc>
+        <w:tc>
+          <w:tcPr>
+            <w:tcW w:type="dxa" w:w="3118"/>
+          </w:tcPr>
+          <w:p>
+            <w:r/>
+            <w:r>
+              <w:rPr>
+                <w:b w:val="0"/>
+                <w:sz w:val="18"/>
+              </w:rPr>
+              <w:t>0.001</w:t>
+            </w:r>
+          </w:p>
+        </w:tc>
+        <w:tc>
+          <w:tcPr>
+            <w:tcW w:type="dxa" w:w="3118"/>
+          </w:tcPr>
+          <w:p>
+            <w:r/>
+            <w:r>
+              <w:rPr>
+                <w:b w:val="0"/>
+                <w:sz w:val="18"/>
+              </w:rPr>
+              <w:t>0.000</w:t>
+            </w:r>
+          </w:p>
+        </w:tc>
+      </w:tr>
+      <w:tr>
+        <w:tc>
+          <w:tcPr>
+            <w:tcW w:type="dxa" w:w="1984"/>
+          </w:tcPr>
+          <w:p>
+            <w:r/>
+            <w:r>
+              <w:rPr>
+                <w:b w:val="0"/>
+                <w:sz w:val="18"/>
+              </w:rPr>
+              <w:t>4 Tage</w:t>
+            </w:r>
+          </w:p>
+        </w:tc>
+        <w:tc>
+          <w:tcPr>
+            <w:tcW w:type="dxa" w:w="3118"/>
+          </w:tcPr>
+          <w:p>
+            <w:r/>
+            <w:r>
+              <w:rPr>
+                <w:b w:val="0"/>
+                <w:sz w:val="18"/>
+              </w:rPr>
+              <w:t>0.001</w:t>
+            </w:r>
+          </w:p>
+        </w:tc>
+        <w:tc>
+          <w:tcPr>
+            <w:tcW w:type="dxa" w:w="3118"/>
+          </w:tcPr>
+          <w:p>
+            <w:r/>
+            <w:r>
+              <w:rPr>
+                <w:b w:val="0"/>
+                <w:sz w:val="18"/>
+              </w:rPr>
+              <w:t>0.000</w:t>
+            </w:r>
+          </w:p>
+        </w:tc>
+      </w:tr>
+      <w:tr>
+        <w:tc>
+          <w:tcPr>
+            <w:tcW w:type="dxa" w:w="1984"/>
+          </w:tcPr>
+          <w:p>
+            <w:r/>
+            <w:r>
+              <w:rPr>
+                <w:b w:val="0"/>
+                <w:sz w:val="18"/>
+              </w:rPr>
+              <w:t>5 Tage</w:t>
+            </w:r>
+          </w:p>
+        </w:tc>
+        <w:tc>
+          <w:tcPr>
+            <w:tcW w:type="dxa" w:w="3118"/>
+          </w:tcPr>
+          <w:p>
+            <w:r/>
+            <w:r>
+              <w:rPr>
+                <w:b w:val="0"/>
+                <w:sz w:val="18"/>
+              </w:rPr>
+              <w:t>0.002</w:t>
+            </w:r>
+          </w:p>
+        </w:tc>
+        <w:tc>
+          <w:tcPr>
+            <w:tcW w:type="dxa" w:w="3118"/>
+          </w:tcPr>
+          <w:p>
+            <w:r/>
+            <w:r>
+              <w:rPr>
+                <w:b w:val="0"/>
+                <w:sz w:val="18"/>
+              </w:rPr>
+              <w:t>0.000</w:t>
+            </w:r>
+          </w:p>
+        </w:tc>
+      </w:tr>
+    </w:tbl>
+    <w:p/>
+    <w:p>
+      <w:r>
+        <w:t>Für beide Wechselkurse ist der Vorhersagebeitrag des Sentiments bei allen getesteten Verzögerungen statistisch signifikant. Bei rund 1100 Beobachtungen werden allerdings schon sehr kleine Effekte signifikant. Die Stärke dieses Beitrags ist gering, passend zu den schwachen Korrelationen bei Verschiebungen grösser null. Das Sentiment trägt also ein schwaches, aber messbares Vorhersagesignal, ist für sich genommen jedoch kein praktisch brauchbarer Frühindikator.</w:t>
+      </w:r>
+    </w:p>
+    <w:p>
+      <w:r>
+        <w:t>Aufschlussreich ist die Gegenrichtung. Bei GBP/USD verbessert die Vergangenheit des Kurses die Vorhersage des Sentiments nicht (alle Werte über 0.29); der Zusammenhang läuft dort also einseitig vom Sentiment zum Kurs. Bei EUR/USD ist der Effekt in beide Richtungen schwach signifikant. Da Sentiment und Kurs zudem stark gleichzeitig zusammenhängen, kann ein Teil dieses Vorhersagebeitrags indirekt aus dem gleichzeitigen Zusammenhang stammen.</w:t>
+      </w:r>
+    </w:p>
+    <w:p>
+      <w:pPr>
+        <w:pStyle w:val="Heading2"/>
+      </w:pPr>
+      <w:r>
+        <w:t>9.5 Warum eine reine Kursgrafik einen Vorlauf vermuten lässt</w:t>
       </w:r>
     </w:p>
     <w:p>
@@ -3524,7 +3866,7 @@
         <w:pStyle w:val="Heading2"/>
       </w:pPr>
       <w:r>
-        <w:t>9.5 Ergebnis der eigenen Datenbeschaffung</w:t>
+        <w:t>9.6 Ergebnis der eigenen Datenbeschaffung</w:t>
       </w:r>
     </w:p>
     <w:p>
@@ -3537,7 +3879,7 @@
         <w:pStyle w:val="Heading2"/>
       </w:pPr>
       <w:r>
-        <w:t>9.6 Öl als möglicher Einflussfaktor</w:t>
+        <w:t>9.7 Öl als möglicher Einflussfaktor</w:t>
       </w:r>
     </w:p>
     <w:p>
@@ -3617,7 +3959,12 @@
     </w:p>
     <w:p>
       <w:r>
-        <w:t>Unsere Antwort: Es besteht ein gesicherter, aber gleichzeitiger Zusammenhang. Bei EUR/USD und GBP/USD bewegen sich Sentiment und Kurs in derselben Periode gemeinsam, mit einem Zusammenhang von 0.18 beziehungsweise 0.21. Einen Vorlauf des Sentiments, der eine Vorhersage erlauben würde, konnten wir nicht feststellen, weder auf Tagesebene noch über das Kursniveau in den Folgewochen. Die Hypothese H1 wird damit nicht gestützt, das Ergebnis passt zur Alternative A1: Das Sentiment ist eine Begleitinformation, kein Frühindikator.</w:t>
+        <w:t>Unsere Antwort: Der Zusammenhang ist überwiegend gleichzeitig. Bei EUR/USD und GBP/USD bewegen sich Sentiment und Kurs in derselben Periode gemeinsam, mit einem Zusammenhang von 0.18 beziehungsweise 0.21. Das Bild ist damit klar von der Alternative A1 geprägt, der gleichzeitigen Bewegung. Einen praktisch nutzbaren Vorlauf konnten wir nicht feststellen, weder in der einfachen Korrelation noch über das Kursniveau in den Folgewochen.</w:t>
+      </w:r>
+    </w:p>
+    <w:p>
+      <w:r>
+        <w:t>Der formale Granger-Test zeigt allerdings eine Feinheit. Die Vergangenheit des Sentiments liefert einen statistisch signifikanten, wenn auch sehr kleinen Beitrag zur Vorhersage der Kursveränderung, bei GBP/USD sogar einseitig vom Sentiment zum Kurs. Die Hypothese H1 ist damit höchstens in einer sehr schwachen Form gestützt: Es gibt ein messbares Vorlaufsignal, das aber zu klein ist, um als Frühindikator zu dienen. In der Praxis bleibt das Sentiment eine Begleitinformation.</w:t>
       </w:r>
     </w:p>
     <w:p>
@@ -3632,7 +3979,7 @@
     </w:p>
     <w:p>
       <w:r>
-        <w:t>Als nächste Schritte bieten sich an: ein spezialisiertes Verfahren zur Sentiment-Messung für Finanztexte einzusetzen, um die vielen neutralen Werte zu verringern, sowie ein formaler statistischer Test auf Vorhersagekraft, der über die einfache Korrelation hinausgeht.</w:t>
+        <w:t>Als nächste Schritte bieten sich an: ein spezialisiertes Verfahren zur Sentiment-Messung für Finanztexte einzusetzen, um die vielen neutralen Werte zu verringern, sowie die eigene Datenbeschaffung über einen längeren Zeitraum laufen zu lassen, damit auch der selbst erstellte Nachrichtenstrom eine belastbare Auswertung erlaubt.</w:t>
       </w:r>
     </w:p>
     <w:p>
@@ -3657,7 +4004,7 @@
           <w:i/>
           <w:sz w:val="18"/>
         </w:rPr>
-        <w:t>Tabelle 7: Glossar der wichtigsten Begriffe</w:t>
+        <w:t>Tabelle 8: Glossar der wichtigsten Begriffe</w:t>
       </w:r>
     </w:p>
     <w:tbl>

</xml_diff>